<commit_message>
docs: update articles with re-docking benchmark, v1.1.0 and test count
</commit_message>
<xml_diff>
--- a/ARTICLE_VinaStudio.docx
+++ b/ARTICLE_VinaStudio.docx
@@ -788,7 +788,12 @@
     <w:p/>
     <w:p>
       <w:r>
-        <w:t>La validation a abouti à un résultat stable : 15 tests passent, avec quelques avertissements non bloquants liés à la robustesse du bootstrap sur des jeux de données constants en statistique. Cette couche de validation est importante pour la préparation d’une publication scientifique, car elle permet de documenter la stabilité du logiciel et la reproductibilité de ses fonctions centrales. Elle ne remplace toutefois pas une validation expérimentale des molécules sélectionnées.</w:t>
+        <w:t xml:space="preserve">La validation a abouti à un résultat stable : 32 tests passent, avec quelques avertissements non bloquants liés à la robustesse du bootstrap sur des jeux de données constants en statistique. Cette couche de validation est importante pour la préparation d’une publication scientifique, car elle permet de documenter la stabilité du logiciel et la reproductibilité de ses fonctions centrales. Elle ne remplace toutefois pas une validation expérimentale des molécules sélectionnées.</w:t>
+      </w:r>
+    </w:p>
+    <w:p>
+      <w:r>
+        <w:t xml:space="preserve">Validation par re-docking. Un banc de re-docking a été exécuté avec le pipeline de VinaStudio sur 16 complexes cristallographiques de transporteurs RND (AcrB n = 10, MexB n = 4, AdeB n = 1, CmeB n = 1), sélectionnés selon des critères fixés avant le docking. La pose classée première reproduit le ligand cristallographique (RMSD &lt; 2 Å) dans 8/16 cas (50 %, IC95 de Wilson 28-72 %) : 7/10 pour AcrB et 0/4 pour MexB. Pour 3W9J, la pose n°1 est à 2,22 Å, avec un noyau reproduit à 0,30 Å. Il s'agit du cas le plus favorable (boîte centrée sur le ligand du cristal) : le re-docking teste la reproduction d'une pose, pas le classement de molécules par ΔG. Les scores obtenus sur MexB doivent donc être lus comme des classements relatifs et non comme des prédictions de pose. Cinq entrées AcrB n'ont pas pu être évaluées faute de fichier au format PDB (mmCIF uniquement).</w:t>
       </w:r>
     </w:p>
     <w:p/>
@@ -906,7 +911,7 @@
         <w:pStyle w:val="ListBullet"/>
       </w:pPr>
       <w:r>
-        <w:t>le projet est encore en phase de maturation scientifique et doit faire l’objet d’un travail de validation sur des cas d’usage plus larges.</w:t>
+        <w:t xml:space="preserve">le projet est encore en phase de maturation scientifique et doit faire l’objet d’un travail de validation sur des cas d’usage plus larges ; le banc de re-docking (section 7) montre en particulier que les poses cristallographiques ne sont pas reproduites sur MexB (0/4).</w:t>
       </w:r>
     </w:p>
     <w:p/>

</xml_diff>